<commit_message>
Fill Lab 3 report identity fields
</commit_message>
<xml_diff>
--- a/Assignment_Lab3/Assignment_Lab3.docx
+++ b/Assignment_Lab3/Assignment_Lab3.docx
@@ -21,12 +21,12 @@
     </w:p>
     <w:p>
       <w:r>
-        <w:t>Name (last name, first name): ______________________________    Date: __________________</w:t>
+        <w:t>Name (last name, first name): Yujing, Hua    Date: October 16, 2026</w:t>
       </w:r>
     </w:p>
     <w:p>
       <w:r>
-        <w:t>Email address: ____________________________________________</w:t>
+        <w:t>Email address: Hi_yuuj-ng@outlook.com</w:t>
       </w:r>
     </w:p>
     <w:p>
@@ -432,7 +432,7 @@
     </w:p>
     <w:p>
       <w:r>
-        <w:t>Signature: ______________________________________    Date: __________________</w:t>
+        <w:t>Signature: Hua Yujing    Date: October 16, 2026</w:t>
       </w:r>
     </w:p>
     <w:sectPr>

</xml_diff>